<commit_message>
Update CV download with latest resume.
</commit_message>
<xml_diff>
--- a/assets/Mark-Tristan-De-Villa-CV.docx
+++ b/assets/Mark-Tristan-De-Villa-CV.docx
@@ -34,29 +34,41 @@
         <w:t>9955095686</w:t>
       </w:r>
       <w:r>
-        <w:t xml:space="preserve"> | </w:t>
-      </w:r>
-      <w:r>
-        <w:t xml:space="preserve">devillamarktristan@gmail.com </w:t>
-      </w:r>
-      <w:r>
-        <w:t>| migilcloud.github.io/</w:t>
+        <w:t xml:space="preserve"> </w:t>
+      </w:r>
+      <w:r>
+        <w:t>| devillamarktristan@gmail.com</w:t>
+      </w:r>
+      <w:r>
+        <w:t xml:space="preserve"> </w:t>
+      </w:r>
+      <w:r>
+        <w:t xml:space="preserve">| </w:t>
+      </w:r>
+      <w:r>
+        <w:t>https://tannntannn.githu</w:t>
+      </w:r>
+      <w:bookmarkStart w:id="0" w:name="_GoBack"/>
+      <w:bookmarkEnd w:id="0"/>
+      <w:r>
+        <w:t>b.io/portfolio</w:t>
+      </w:r>
+      <w:r>
+        <w:t xml:space="preserve"> </w:t>
+      </w:r>
+      <w:r>
+        <w:t xml:space="preserve">| </w:t>
       </w:r>
       <w:proofErr w:type="spellStart"/>
       <w:r>
-        <w:t>migs</w:t>
+        <w:t>Sariaya</w:t>
       </w:r>
       <w:proofErr w:type="spellEnd"/>
       <w:r>
-        <w:t xml:space="preserve"> | </w:t>
-      </w:r>
-      <w:proofErr w:type="spellStart"/>
-      <w:r>
-        <w:t>Sariaya</w:t>
-      </w:r>
-      <w:proofErr w:type="spellEnd"/>
-      <w:r>
-        <w:t>, Quezon, Philippines</w:t>
+        <w:t xml:space="preserve">, Quezon, </w:t>
+      </w:r>
+      <w:r>
+        <w:t>PH</w:t>
       </w:r>
     </w:p>
     <w:p>
@@ -471,18 +483,6 @@
       <w:r>
         <w:t xml:space="preserve"> for secure user management, data storage, and classroom management.</w:t>
       </w:r>
-    </w:p>
-    <w:p>
-      <w:pPr>
-        <w:pStyle w:val="ListBullet"/>
-        <w:numPr>
-          <w:ilvl w:val="0"/>
-          <w:numId w:val="0"/>
-        </w:numPr>
-        <w:spacing w:line="240" w:lineRule="auto"/>
-        <w:ind w:left="360"/>
-        <w:jc w:val="both"/>
-      </w:pPr>
     </w:p>
     <w:p>
       <w:pPr>
@@ -493,51 +493,70 @@
         </w:numPr>
         <w:jc w:val="both"/>
       </w:pPr>
-      <w:proofErr w:type="spellStart"/>
-      <w:r>
-        <w:t>AspireWrite</w:t>
-      </w:r>
-      <w:proofErr w:type="spellEnd"/>
-      <w:r>
-        <w:tab/>
-      </w:r>
-      <w:r>
-        <w:tab/>
-      </w:r>
-      <w:r>
-        <w:tab/>
-      </w:r>
-      <w:r>
-        <w:tab/>
-      </w:r>
-      <w:r>
-        <w:tab/>
-      </w:r>
-      <w:r>
-        <w:tab/>
-      </w:r>
-      <w:r>
-        <w:t xml:space="preserve">                 </w:t>
-      </w:r>
-      <w:r>
-        <w:t xml:space="preserve">                                              </w:t>
-      </w:r>
-      <w:r>
-        <w:t xml:space="preserve">   </w:t>
-      </w:r>
-      <w:r>
-        <w:t xml:space="preserve">  </w:t>
-      </w:r>
-      <w:r>
-        <w:t>Feb 2023 -</w:t>
-      </w:r>
-      <w:r>
-        <w:t xml:space="preserve"> 2026</w:t>
-      </w:r>
     </w:p>
     <w:p>
       <w:pPr>
-        <w:spacing w:after="0"/>
+        <w:pStyle w:val="ListBullet"/>
+        <w:numPr>
+          <w:ilvl w:val="0"/>
+          <w:numId w:val="0"/>
+        </w:numPr>
+        <w:jc w:val="both"/>
+      </w:pPr>
+      <w:proofErr w:type="spellStart"/>
+      <w:r>
+        <w:t>AspireWrite</w:t>
+      </w:r>
+      <w:proofErr w:type="spellEnd"/>
+      <w:r>
+        <w:tab/>
+      </w:r>
+      <w:r>
+        <w:tab/>
+      </w:r>
+      <w:r>
+        <w:tab/>
+      </w:r>
+      <w:r>
+        <w:tab/>
+      </w:r>
+      <w:r>
+        <w:tab/>
+      </w:r>
+      <w:r>
+        <w:tab/>
+      </w:r>
+      <w:r>
+        <w:tab/>
+      </w:r>
+      <w:r>
+        <w:tab/>
+      </w:r>
+      <w:r>
+        <w:tab/>
+        <w:t xml:space="preserve">                            </w:t>
+      </w:r>
+      <w:r>
+        <w:t>Feb 2023</w:t>
+      </w:r>
+      <w:r>
+        <w:t xml:space="preserve"> - July</w:t>
+      </w:r>
+      <w:r>
+        <w:t xml:space="preserve"> </w:t>
+      </w:r>
+      <w:r>
+        <w:t>2026</w:t>
+      </w:r>
+    </w:p>
+    <w:p>
+      <w:pPr>
+        <w:pStyle w:val="ListBullet"/>
+        <w:numPr>
+          <w:ilvl w:val="0"/>
+          <w:numId w:val="0"/>
+        </w:numPr>
+        <w:ind w:left="360" w:hanging="360"/>
         <w:jc w:val="both"/>
       </w:pPr>
       <w:r>
@@ -559,29 +578,41 @@
     </w:p>
     <w:p>
       <w:pPr>
-        <w:spacing w:after="0"/>
+        <w:pStyle w:val="ListBullet"/>
+        <w:numPr>
+          <w:ilvl w:val="0"/>
+          <w:numId w:val="16"/>
+        </w:numPr>
         <w:jc w:val="both"/>
       </w:pPr>
       <w:r>
-        <w:t>• Developed a full-stack literary content platform for discovering, uploading, and reading creative works with secure user authentication.</w:t>
+        <w:t>Developed a full-stack literary content platform for discovering, uploading, and reading creative works with secure user authentication.</w:t>
       </w:r>
     </w:p>
     <w:p>
       <w:pPr>
-        <w:spacing w:after="0"/>
+        <w:pStyle w:val="ListBullet"/>
+        <w:numPr>
+          <w:ilvl w:val="0"/>
+          <w:numId w:val="16"/>
+        </w:numPr>
         <w:jc w:val="both"/>
       </w:pPr>
       <w:r>
-        <w:t>• Implemented content uploads, category browsing, search, comments, star ratings, and public author profiles.</w:t>
+        <w:t>Implemented content uploads, category browsing, search, comments, star ratings, and public author profiles.</w:t>
       </w:r>
     </w:p>
     <w:p>
       <w:pPr>
-        <w:spacing w:after="0"/>
+        <w:pStyle w:val="ListBullet"/>
+        <w:numPr>
+          <w:ilvl w:val="0"/>
+          <w:numId w:val="16"/>
+        </w:numPr>
         <w:jc w:val="both"/>
       </w:pPr>
       <w:r>
-        <w:t xml:space="preserve">• Integrated Firebase for auth and real-time data storage, and </w:t>
+        <w:t xml:space="preserve">Integrated Firebase for auth and real-time data storage, and </w:t>
       </w:r>
       <w:proofErr w:type="spellStart"/>
       <w:r>
@@ -591,12 +622,6 @@
       <w:r>
         <w:t xml:space="preserve"> for cover image and PDF uploads.</w:t>
       </w:r>
-    </w:p>
-    <w:p>
-      <w:pPr>
-        <w:spacing w:after="0"/>
-        <w:jc w:val="both"/>
-      </w:pPr>
     </w:p>
     <w:p>
       <w:pPr>
@@ -631,30 +656,44 @@
     </w:p>
     <w:p>
       <w:pPr>
+        <w:pStyle w:val="ListParagraph"/>
+        <w:numPr>
+          <w:ilvl w:val="0"/>
+          <w:numId w:val="18"/>
+        </w:numPr>
         <w:spacing w:after="0"/>
         <w:jc w:val="both"/>
       </w:pPr>
       <w:r>
-        <w:t>• Developed a campus marketplace web app for SLSU students to buy and sell preloved items with secure authentication.</w:t>
+        <w:t>Developed a campus marketplace web app for SLSU students to buy and sell preloved items with secure authentication.</w:t>
       </w:r>
     </w:p>
     <w:p>
       <w:pPr>
+        <w:pStyle w:val="ListParagraph"/>
+        <w:numPr>
+          <w:ilvl w:val="0"/>
+          <w:numId w:val="18"/>
+        </w:numPr>
         <w:spacing w:after="0"/>
         <w:jc w:val="both"/>
       </w:pPr>
       <w:r>
-        <w:t>• Implemented item listing, browsing/search, seller management, buyer–seller chat, notifications, and purchase receipts.</w:t>
+        <w:t>Implemented item listing, browsing/search, seller management, buyer–seller chat, notifications, and purchase receipts.</w:t>
       </w:r>
     </w:p>
     <w:p>
       <w:pPr>
+        <w:pStyle w:val="ListParagraph"/>
+        <w:numPr>
+          <w:ilvl w:val="0"/>
+          <w:numId w:val="18"/>
+        </w:numPr>
         <w:spacing w:after="0"/>
         <w:jc w:val="both"/>
       </w:pPr>
       <w:r>
-        <w:lastRenderedPageBreak/>
-        <w:t xml:space="preserve">• Integrated Firebase for auth and </w:t>
+        <w:t xml:space="preserve">Integrated Firebase for auth and </w:t>
       </w:r>
       <w:proofErr w:type="spellStart"/>
       <w:r>
@@ -725,32 +764,44 @@
     </w:p>
     <w:p>
       <w:pPr>
+        <w:pStyle w:val="ListParagraph"/>
+        <w:numPr>
+          <w:ilvl w:val="0"/>
+          <w:numId w:val="18"/>
+        </w:numPr>
         <w:spacing w:after="0"/>
         <w:jc w:val="both"/>
       </w:pPr>
       <w:r>
-        <w:t>• Developed a full-stack gym attendance and membership system with admin and member portals.</w:t>
+        <w:t>Developed a full-stack gym attendance and membership system with admin and member portals.</w:t>
       </w:r>
     </w:p>
     <w:p>
       <w:pPr>
+        <w:pStyle w:val="ListParagraph"/>
+        <w:numPr>
+          <w:ilvl w:val="0"/>
+          <w:numId w:val="18"/>
+        </w:numPr>
         <w:spacing w:after="0"/>
         <w:jc w:val="both"/>
       </w:pPr>
       <w:r>
-        <w:t>• Implemented QR-based check-in, member registration, payment tracking, loyalty features, and Excel/PDF reporting.</w:t>
+        <w:t>Implemented QR-based check-in, member registration, payment tracking, loyalty features, and Excel/PDF reporting.</w:t>
       </w:r>
     </w:p>
     <w:p>
       <w:pPr>
+        <w:pStyle w:val="ListParagraph"/>
+        <w:numPr>
+          <w:ilvl w:val="0"/>
+          <w:numId w:val="18"/>
+        </w:numPr>
         <w:spacing w:after="0"/>
         <w:jc w:val="both"/>
       </w:pPr>
       <w:r>
-        <w:t>• Designed database models with Prisma and</w:t>
-      </w:r>
-      <w:r>
-        <w:t xml:space="preserve"> </w:t>
+        <w:t xml:space="preserve">Designed database models with Prisma and </w:t>
       </w:r>
       <w:proofErr w:type="spellStart"/>
       <w:r>
@@ -770,7 +821,10 @@
       </w:r>
       <w:proofErr w:type="spellStart"/>
       <w:r>
-        <w:t>Vercel</w:t>
+        <w:t>Verce</w:t>
+      </w:r>
+      <w:r>
+        <w:t>l</w:t>
       </w:r>
       <w:proofErr w:type="spellEnd"/>
       <w:r>
@@ -845,29 +899,44 @@
     </w:p>
     <w:p>
       <w:pPr>
+        <w:pStyle w:val="ListParagraph"/>
+        <w:numPr>
+          <w:ilvl w:val="0"/>
+          <w:numId w:val="18"/>
+        </w:numPr>
         <w:spacing w:after="0"/>
         <w:jc w:val="both"/>
       </w:pPr>
       <w:r>
-        <w:t>• Developed a full-stack photography studio booking platform with online scheduling, payments, and client galleries.</w:t>
+        <w:t>Developed a full-stack photography studio booking platform with online scheduling, payments, and client galleries.</w:t>
       </w:r>
     </w:p>
     <w:p>
       <w:pPr>
+        <w:pStyle w:val="ListParagraph"/>
+        <w:numPr>
+          <w:ilvl w:val="0"/>
+          <w:numId w:val="18"/>
+        </w:numPr>
         <w:spacing w:after="0"/>
         <w:jc w:val="both"/>
       </w:pPr>
       <w:r>
-        <w:t>• Implemented package booking, payment verification, portfolio management, mood boards, FAQ chatbot, and QR booking checks.</w:t>
+        <w:t>Implemented package booking, payment verification, portfolio management, mood boards, FAQ chatbot, and QR booking checks.</w:t>
       </w:r>
     </w:p>
     <w:p>
       <w:pPr>
+        <w:pStyle w:val="ListParagraph"/>
+        <w:numPr>
+          <w:ilvl w:val="0"/>
+          <w:numId w:val="18"/>
+        </w:numPr>
         <w:spacing w:after="0"/>
         <w:jc w:val="both"/>
       </w:pPr>
       <w:r>
-        <w:t xml:space="preserve">• Integrated </w:t>
+        <w:t xml:space="preserve">Integrated </w:t>
       </w:r>
       <w:proofErr w:type="spellStart"/>
       <w:r>
@@ -883,13 +952,7 @@
       </w:r>
       <w:proofErr w:type="spellEnd"/>
       <w:r>
-        <w:t xml:space="preserve"> for media uploads, and AI image analysis for </w:t>
-      </w:r>
-      <w:r>
-        <w:t xml:space="preserve">  </w:t>
-      </w:r>
-      <w:r>
-        <w:t>mood board suggestions.</w:t>
+        <w:t xml:space="preserve"> for media uploads, and AI image analysis for   mood board suggestions.</w:t>
       </w:r>
     </w:p>
     <w:p>
@@ -1251,10 +1314,7 @@
               <w:t>Basic knowledge</w:t>
             </w:r>
             <w:r>
-              <w:t xml:space="preserve"> in </w:t>
-            </w:r>
-            <w:r>
-              <w:t xml:space="preserve">Computer/Laptop </w:t>
+              <w:t xml:space="preserve"> in Computer/Laptop </w:t>
             </w:r>
             <w:proofErr w:type="spellStart"/>
             <w:r>
@@ -1278,10 +1338,7 @@
               <w:t>•</w:t>
             </w:r>
             <w:r>
-              <w:t xml:space="preserve"> </w:t>
-            </w:r>
-            <w:r>
-              <w:t>Project Management</w:t>
+              <w:t xml:space="preserve"> Project Management</w:t>
             </w:r>
           </w:p>
         </w:tc>
@@ -1302,10 +1359,7 @@
               <w:t>Basic knowledge</w:t>
             </w:r>
             <w:r>
-              <w:t xml:space="preserve"> in </w:t>
-            </w:r>
-            <w:r>
-              <w:t xml:space="preserve">Software Troubleshooting (Windows </w:t>
+              <w:t xml:space="preserve"> in Software Troubleshooting (Windows </w:t>
             </w:r>
             <w:proofErr w:type="spellStart"/>
             <w:r>
@@ -1424,6 +1478,21 @@
     <w:p>
       <w:pPr>
         <w:pStyle w:val="ListBullet"/>
+        <w:numPr>
+          <w:ilvl w:val="0"/>
+          <w:numId w:val="0"/>
+        </w:numPr>
+        <w:ind w:left="360"/>
+        <w:jc w:val="both"/>
+      </w:pPr>
+    </w:p>
+    <w:p>
+      <w:pPr>
+        <w:pStyle w:val="ListBullet"/>
+        <w:numPr>
+          <w:ilvl w:val="0"/>
+          <w:numId w:val="0"/>
+        </w:numPr>
         <w:jc w:val="both"/>
       </w:pPr>
       <w:r>
@@ -1476,7 +1545,7 @@
           <w:lang w:eastAsia="en-PH"/>
         </w:rPr>
       </w:pPr>
-      <w:bookmarkStart w:id="0" w:name="_Hlk221490509"/>
+      <w:bookmarkStart w:id="1" w:name="_Hlk221490509"/>
       <w:r>
         <w:rPr>
           <w:lang w:eastAsia="en-PH"/>
@@ -1545,8 +1614,6 @@
         </w:rPr>
         <w:t>Amplify Talent, and Excel Beyond IT Expectation</w:t>
       </w:r>
-      <w:bookmarkStart w:id="1" w:name="_GoBack"/>
-      <w:bookmarkEnd w:id="0"/>
       <w:bookmarkEnd w:id="1"/>
     </w:p>
     <w:sectPr>
@@ -1882,6 +1949,793 @@
     </w:lvl>
   </w:abstractNum>
   <w:abstractNum w:abstractNumId="10" w15:restartNumberingAfterBreak="0">
+    <w:nsid w:val="119B07BE"/>
+    <w:multiLevelType w:val="hybridMultilevel"/>
+    <w:tmpl w:val="89E6AEA8"/>
+    <w:lvl w:ilvl="0" w:tplc="34090001">
+      <w:start w:val="1"/>
+      <w:numFmt w:val="bullet"/>
+      <w:lvlText w:val=""/>
+      <w:lvlJc w:val="left"/>
+      <w:pPr>
+        <w:ind w:left="720" w:hanging="360"/>
+      </w:pPr>
+      <w:rPr>
+        <w:rFonts w:ascii="Symbol" w:hAnsi="Symbol" w:hint="default"/>
+      </w:rPr>
+    </w:lvl>
+    <w:lvl w:ilvl="1" w:tplc="34090003" w:tentative="1">
+      <w:start w:val="1"/>
+      <w:numFmt w:val="bullet"/>
+      <w:lvlText w:val="o"/>
+      <w:lvlJc w:val="left"/>
+      <w:pPr>
+        <w:ind w:left="1440" w:hanging="360"/>
+      </w:pPr>
+      <w:rPr>
+        <w:rFonts w:ascii="Courier New" w:hAnsi="Courier New" w:cs="Courier New" w:hint="default"/>
+      </w:rPr>
+    </w:lvl>
+    <w:lvl w:ilvl="2" w:tplc="34090005" w:tentative="1">
+      <w:start w:val="1"/>
+      <w:numFmt w:val="bullet"/>
+      <w:lvlText w:val=""/>
+      <w:lvlJc w:val="left"/>
+      <w:pPr>
+        <w:ind w:left="2160" w:hanging="360"/>
+      </w:pPr>
+      <w:rPr>
+        <w:rFonts w:ascii="Wingdings" w:hAnsi="Wingdings" w:hint="default"/>
+      </w:rPr>
+    </w:lvl>
+    <w:lvl w:ilvl="3" w:tplc="34090001" w:tentative="1">
+      <w:start w:val="1"/>
+      <w:numFmt w:val="bullet"/>
+      <w:lvlText w:val=""/>
+      <w:lvlJc w:val="left"/>
+      <w:pPr>
+        <w:ind w:left="2880" w:hanging="360"/>
+      </w:pPr>
+      <w:rPr>
+        <w:rFonts w:ascii="Symbol" w:hAnsi="Symbol" w:hint="default"/>
+      </w:rPr>
+    </w:lvl>
+    <w:lvl w:ilvl="4" w:tplc="34090003" w:tentative="1">
+      <w:start w:val="1"/>
+      <w:numFmt w:val="bullet"/>
+      <w:lvlText w:val="o"/>
+      <w:lvlJc w:val="left"/>
+      <w:pPr>
+        <w:ind w:left="3600" w:hanging="360"/>
+      </w:pPr>
+      <w:rPr>
+        <w:rFonts w:ascii="Courier New" w:hAnsi="Courier New" w:cs="Courier New" w:hint="default"/>
+      </w:rPr>
+    </w:lvl>
+    <w:lvl w:ilvl="5" w:tplc="34090005" w:tentative="1">
+      <w:start w:val="1"/>
+      <w:numFmt w:val="bullet"/>
+      <w:lvlText w:val=""/>
+      <w:lvlJc w:val="left"/>
+      <w:pPr>
+        <w:ind w:left="4320" w:hanging="360"/>
+      </w:pPr>
+      <w:rPr>
+        <w:rFonts w:ascii="Wingdings" w:hAnsi="Wingdings" w:hint="default"/>
+      </w:rPr>
+    </w:lvl>
+    <w:lvl w:ilvl="6" w:tplc="34090001" w:tentative="1">
+      <w:start w:val="1"/>
+      <w:numFmt w:val="bullet"/>
+      <w:lvlText w:val=""/>
+      <w:lvlJc w:val="left"/>
+      <w:pPr>
+        <w:ind w:left="5040" w:hanging="360"/>
+      </w:pPr>
+      <w:rPr>
+        <w:rFonts w:ascii="Symbol" w:hAnsi="Symbol" w:hint="default"/>
+      </w:rPr>
+    </w:lvl>
+    <w:lvl w:ilvl="7" w:tplc="34090003" w:tentative="1">
+      <w:start w:val="1"/>
+      <w:numFmt w:val="bullet"/>
+      <w:lvlText w:val="o"/>
+      <w:lvlJc w:val="left"/>
+      <w:pPr>
+        <w:ind w:left="5760" w:hanging="360"/>
+      </w:pPr>
+      <w:rPr>
+        <w:rFonts w:ascii="Courier New" w:hAnsi="Courier New" w:cs="Courier New" w:hint="default"/>
+      </w:rPr>
+    </w:lvl>
+    <w:lvl w:ilvl="8" w:tplc="34090005" w:tentative="1">
+      <w:start w:val="1"/>
+      <w:numFmt w:val="bullet"/>
+      <w:lvlText w:val=""/>
+      <w:lvlJc w:val="left"/>
+      <w:pPr>
+        <w:ind w:left="6480" w:hanging="360"/>
+      </w:pPr>
+      <w:rPr>
+        <w:rFonts w:ascii="Wingdings" w:hAnsi="Wingdings" w:hint="default"/>
+      </w:rPr>
+    </w:lvl>
+  </w:abstractNum>
+  <w:abstractNum w:abstractNumId="11" w15:restartNumberingAfterBreak="0">
+    <w:nsid w:val="13B004D7"/>
+    <w:multiLevelType w:val="hybridMultilevel"/>
+    <w:tmpl w:val="9BCA0272"/>
+    <w:lvl w:ilvl="0" w:tplc="34090001">
+      <w:start w:val="1"/>
+      <w:numFmt w:val="bullet"/>
+      <w:lvlText w:val=""/>
+      <w:lvlJc w:val="left"/>
+      <w:pPr>
+        <w:ind w:left="360" w:hanging="360"/>
+      </w:pPr>
+      <w:rPr>
+        <w:rFonts w:ascii="Symbol" w:hAnsi="Symbol" w:hint="default"/>
+      </w:rPr>
+    </w:lvl>
+    <w:lvl w:ilvl="1" w:tplc="34090003" w:tentative="1">
+      <w:start w:val="1"/>
+      <w:numFmt w:val="bullet"/>
+      <w:lvlText w:val="o"/>
+      <w:lvlJc w:val="left"/>
+      <w:pPr>
+        <w:ind w:left="1080" w:hanging="360"/>
+      </w:pPr>
+      <w:rPr>
+        <w:rFonts w:ascii="Courier New" w:hAnsi="Courier New" w:cs="Courier New" w:hint="default"/>
+      </w:rPr>
+    </w:lvl>
+    <w:lvl w:ilvl="2" w:tplc="34090005" w:tentative="1">
+      <w:start w:val="1"/>
+      <w:numFmt w:val="bullet"/>
+      <w:lvlText w:val=""/>
+      <w:lvlJc w:val="left"/>
+      <w:pPr>
+        <w:ind w:left="1800" w:hanging="360"/>
+      </w:pPr>
+      <w:rPr>
+        <w:rFonts w:ascii="Wingdings" w:hAnsi="Wingdings" w:hint="default"/>
+      </w:rPr>
+    </w:lvl>
+    <w:lvl w:ilvl="3" w:tplc="34090001" w:tentative="1">
+      <w:start w:val="1"/>
+      <w:numFmt w:val="bullet"/>
+      <w:lvlText w:val=""/>
+      <w:lvlJc w:val="left"/>
+      <w:pPr>
+        <w:ind w:left="2520" w:hanging="360"/>
+      </w:pPr>
+      <w:rPr>
+        <w:rFonts w:ascii="Symbol" w:hAnsi="Symbol" w:hint="default"/>
+      </w:rPr>
+    </w:lvl>
+    <w:lvl w:ilvl="4" w:tplc="34090003" w:tentative="1">
+      <w:start w:val="1"/>
+      <w:numFmt w:val="bullet"/>
+      <w:lvlText w:val="o"/>
+      <w:lvlJc w:val="left"/>
+      <w:pPr>
+        <w:ind w:left="3240" w:hanging="360"/>
+      </w:pPr>
+      <w:rPr>
+        <w:rFonts w:ascii="Courier New" w:hAnsi="Courier New" w:cs="Courier New" w:hint="default"/>
+      </w:rPr>
+    </w:lvl>
+    <w:lvl w:ilvl="5" w:tplc="34090005" w:tentative="1">
+      <w:start w:val="1"/>
+      <w:numFmt w:val="bullet"/>
+      <w:lvlText w:val=""/>
+      <w:lvlJc w:val="left"/>
+      <w:pPr>
+        <w:ind w:left="3960" w:hanging="360"/>
+      </w:pPr>
+      <w:rPr>
+        <w:rFonts w:ascii="Wingdings" w:hAnsi="Wingdings" w:hint="default"/>
+      </w:rPr>
+    </w:lvl>
+    <w:lvl w:ilvl="6" w:tplc="34090001" w:tentative="1">
+      <w:start w:val="1"/>
+      <w:numFmt w:val="bullet"/>
+      <w:lvlText w:val=""/>
+      <w:lvlJc w:val="left"/>
+      <w:pPr>
+        <w:ind w:left="4680" w:hanging="360"/>
+      </w:pPr>
+      <w:rPr>
+        <w:rFonts w:ascii="Symbol" w:hAnsi="Symbol" w:hint="default"/>
+      </w:rPr>
+    </w:lvl>
+    <w:lvl w:ilvl="7" w:tplc="34090003" w:tentative="1">
+      <w:start w:val="1"/>
+      <w:numFmt w:val="bullet"/>
+      <w:lvlText w:val="o"/>
+      <w:lvlJc w:val="left"/>
+      <w:pPr>
+        <w:ind w:left="5400" w:hanging="360"/>
+      </w:pPr>
+      <w:rPr>
+        <w:rFonts w:ascii="Courier New" w:hAnsi="Courier New" w:cs="Courier New" w:hint="default"/>
+      </w:rPr>
+    </w:lvl>
+    <w:lvl w:ilvl="8" w:tplc="34090005" w:tentative="1">
+      <w:start w:val="1"/>
+      <w:numFmt w:val="bullet"/>
+      <w:lvlText w:val=""/>
+      <w:lvlJc w:val="left"/>
+      <w:pPr>
+        <w:ind w:left="6120" w:hanging="360"/>
+      </w:pPr>
+      <w:rPr>
+        <w:rFonts w:ascii="Wingdings" w:hAnsi="Wingdings" w:hint="default"/>
+      </w:rPr>
+    </w:lvl>
+  </w:abstractNum>
+  <w:abstractNum w:abstractNumId="12" w15:restartNumberingAfterBreak="0">
+    <w:nsid w:val="14AD6CAC"/>
+    <w:multiLevelType w:val="hybridMultilevel"/>
+    <w:tmpl w:val="8ABCD5B4"/>
+    <w:lvl w:ilvl="0" w:tplc="C3B8F722">
+      <w:numFmt w:val="bullet"/>
+      <w:lvlText w:val="•"/>
+      <w:lvlJc w:val="left"/>
+      <w:pPr>
+        <w:ind w:left="360" w:hanging="360"/>
+      </w:pPr>
+      <w:rPr>
+        <w:rFonts w:ascii="Cambria" w:eastAsiaTheme="minorEastAsia" w:hAnsi="Cambria" w:cstheme="minorBidi" w:hint="default"/>
+      </w:rPr>
+    </w:lvl>
+    <w:lvl w:ilvl="1" w:tplc="34090003" w:tentative="1">
+      <w:start w:val="1"/>
+      <w:numFmt w:val="bullet"/>
+      <w:lvlText w:val="o"/>
+      <w:lvlJc w:val="left"/>
+      <w:pPr>
+        <w:ind w:left="1440" w:hanging="360"/>
+      </w:pPr>
+      <w:rPr>
+        <w:rFonts w:ascii="Courier New" w:hAnsi="Courier New" w:cs="Courier New" w:hint="default"/>
+      </w:rPr>
+    </w:lvl>
+    <w:lvl w:ilvl="2" w:tplc="34090005" w:tentative="1">
+      <w:start w:val="1"/>
+      <w:numFmt w:val="bullet"/>
+      <w:lvlText w:val=""/>
+      <w:lvlJc w:val="left"/>
+      <w:pPr>
+        <w:ind w:left="2160" w:hanging="360"/>
+      </w:pPr>
+      <w:rPr>
+        <w:rFonts w:ascii="Wingdings" w:hAnsi="Wingdings" w:hint="default"/>
+      </w:rPr>
+    </w:lvl>
+    <w:lvl w:ilvl="3" w:tplc="34090001" w:tentative="1">
+      <w:start w:val="1"/>
+      <w:numFmt w:val="bullet"/>
+      <w:lvlText w:val=""/>
+      <w:lvlJc w:val="left"/>
+      <w:pPr>
+        <w:ind w:left="2880" w:hanging="360"/>
+      </w:pPr>
+      <w:rPr>
+        <w:rFonts w:ascii="Symbol" w:hAnsi="Symbol" w:hint="default"/>
+      </w:rPr>
+    </w:lvl>
+    <w:lvl w:ilvl="4" w:tplc="34090003" w:tentative="1">
+      <w:start w:val="1"/>
+      <w:numFmt w:val="bullet"/>
+      <w:lvlText w:val="o"/>
+      <w:lvlJc w:val="left"/>
+      <w:pPr>
+        <w:ind w:left="3600" w:hanging="360"/>
+      </w:pPr>
+      <w:rPr>
+        <w:rFonts w:ascii="Courier New" w:hAnsi="Courier New" w:cs="Courier New" w:hint="default"/>
+      </w:rPr>
+    </w:lvl>
+    <w:lvl w:ilvl="5" w:tplc="34090005" w:tentative="1">
+      <w:start w:val="1"/>
+      <w:numFmt w:val="bullet"/>
+      <w:lvlText w:val=""/>
+      <w:lvlJc w:val="left"/>
+      <w:pPr>
+        <w:ind w:left="4320" w:hanging="360"/>
+      </w:pPr>
+      <w:rPr>
+        <w:rFonts w:ascii="Wingdings" w:hAnsi="Wingdings" w:hint="default"/>
+      </w:rPr>
+    </w:lvl>
+    <w:lvl w:ilvl="6" w:tplc="34090001" w:tentative="1">
+      <w:start w:val="1"/>
+      <w:numFmt w:val="bullet"/>
+      <w:lvlText w:val=""/>
+      <w:lvlJc w:val="left"/>
+      <w:pPr>
+        <w:ind w:left="5040" w:hanging="360"/>
+      </w:pPr>
+      <w:rPr>
+        <w:rFonts w:ascii="Symbol" w:hAnsi="Symbol" w:hint="default"/>
+      </w:rPr>
+    </w:lvl>
+    <w:lvl w:ilvl="7" w:tplc="34090003" w:tentative="1">
+      <w:start w:val="1"/>
+      <w:numFmt w:val="bullet"/>
+      <w:lvlText w:val="o"/>
+      <w:lvlJc w:val="left"/>
+      <w:pPr>
+        <w:ind w:left="5760" w:hanging="360"/>
+      </w:pPr>
+      <w:rPr>
+        <w:rFonts w:ascii="Courier New" w:hAnsi="Courier New" w:cs="Courier New" w:hint="default"/>
+      </w:rPr>
+    </w:lvl>
+    <w:lvl w:ilvl="8" w:tplc="34090005" w:tentative="1">
+      <w:start w:val="1"/>
+      <w:numFmt w:val="bullet"/>
+      <w:lvlText w:val=""/>
+      <w:lvlJc w:val="left"/>
+      <w:pPr>
+        <w:ind w:left="6480" w:hanging="360"/>
+      </w:pPr>
+      <w:rPr>
+        <w:rFonts w:ascii="Wingdings" w:hAnsi="Wingdings" w:hint="default"/>
+      </w:rPr>
+    </w:lvl>
+  </w:abstractNum>
+  <w:abstractNum w:abstractNumId="13" w15:restartNumberingAfterBreak="0">
+    <w:nsid w:val="32B33B90"/>
+    <w:multiLevelType w:val="hybridMultilevel"/>
+    <w:tmpl w:val="8878E3EA"/>
+    <w:lvl w:ilvl="0" w:tplc="34090001">
+      <w:start w:val="1"/>
+      <w:numFmt w:val="bullet"/>
+      <w:lvlText w:val=""/>
+      <w:lvlJc w:val="left"/>
+      <w:pPr>
+        <w:ind w:left="720" w:hanging="360"/>
+      </w:pPr>
+      <w:rPr>
+        <w:rFonts w:ascii="Symbol" w:hAnsi="Symbol" w:hint="default"/>
+      </w:rPr>
+    </w:lvl>
+    <w:lvl w:ilvl="1" w:tplc="34090003">
+      <w:start w:val="1"/>
+      <w:numFmt w:val="bullet"/>
+      <w:lvlText w:val="o"/>
+      <w:lvlJc w:val="left"/>
+      <w:pPr>
+        <w:ind w:left="1440" w:hanging="360"/>
+      </w:pPr>
+      <w:rPr>
+        <w:rFonts w:ascii="Courier New" w:hAnsi="Courier New" w:cs="Courier New" w:hint="default"/>
+      </w:rPr>
+    </w:lvl>
+    <w:lvl w:ilvl="2" w:tplc="34090005" w:tentative="1">
+      <w:start w:val="1"/>
+      <w:numFmt w:val="bullet"/>
+      <w:lvlText w:val=""/>
+      <w:lvlJc w:val="left"/>
+      <w:pPr>
+        <w:ind w:left="2160" w:hanging="360"/>
+      </w:pPr>
+      <w:rPr>
+        <w:rFonts w:ascii="Wingdings" w:hAnsi="Wingdings" w:hint="default"/>
+      </w:rPr>
+    </w:lvl>
+    <w:lvl w:ilvl="3" w:tplc="34090001" w:tentative="1">
+      <w:start w:val="1"/>
+      <w:numFmt w:val="bullet"/>
+      <w:lvlText w:val=""/>
+      <w:lvlJc w:val="left"/>
+      <w:pPr>
+        <w:ind w:left="2880" w:hanging="360"/>
+      </w:pPr>
+      <w:rPr>
+        <w:rFonts w:ascii="Symbol" w:hAnsi="Symbol" w:hint="default"/>
+      </w:rPr>
+    </w:lvl>
+    <w:lvl w:ilvl="4" w:tplc="34090003" w:tentative="1">
+      <w:start w:val="1"/>
+      <w:numFmt w:val="bullet"/>
+      <w:lvlText w:val="o"/>
+      <w:lvlJc w:val="left"/>
+      <w:pPr>
+        <w:ind w:left="3600" w:hanging="360"/>
+      </w:pPr>
+      <w:rPr>
+        <w:rFonts w:ascii="Courier New" w:hAnsi="Courier New" w:cs="Courier New" w:hint="default"/>
+      </w:rPr>
+    </w:lvl>
+    <w:lvl w:ilvl="5" w:tplc="34090005" w:tentative="1">
+      <w:start w:val="1"/>
+      <w:numFmt w:val="bullet"/>
+      <w:lvlText w:val=""/>
+      <w:lvlJc w:val="left"/>
+      <w:pPr>
+        <w:ind w:left="4320" w:hanging="360"/>
+      </w:pPr>
+      <w:rPr>
+        <w:rFonts w:ascii="Wingdings" w:hAnsi="Wingdings" w:hint="default"/>
+      </w:rPr>
+    </w:lvl>
+    <w:lvl w:ilvl="6" w:tplc="34090001" w:tentative="1">
+      <w:start w:val="1"/>
+      <w:numFmt w:val="bullet"/>
+      <w:lvlText w:val=""/>
+      <w:lvlJc w:val="left"/>
+      <w:pPr>
+        <w:ind w:left="5040" w:hanging="360"/>
+      </w:pPr>
+      <w:rPr>
+        <w:rFonts w:ascii="Symbol" w:hAnsi="Symbol" w:hint="default"/>
+      </w:rPr>
+    </w:lvl>
+    <w:lvl w:ilvl="7" w:tplc="34090003" w:tentative="1">
+      <w:start w:val="1"/>
+      <w:numFmt w:val="bullet"/>
+      <w:lvlText w:val="o"/>
+      <w:lvlJc w:val="left"/>
+      <w:pPr>
+        <w:ind w:left="5760" w:hanging="360"/>
+      </w:pPr>
+      <w:rPr>
+        <w:rFonts w:ascii="Courier New" w:hAnsi="Courier New" w:cs="Courier New" w:hint="default"/>
+      </w:rPr>
+    </w:lvl>
+    <w:lvl w:ilvl="8" w:tplc="34090005" w:tentative="1">
+      <w:start w:val="1"/>
+      <w:numFmt w:val="bullet"/>
+      <w:lvlText w:val=""/>
+      <w:lvlJc w:val="left"/>
+      <w:pPr>
+        <w:ind w:left="6480" w:hanging="360"/>
+      </w:pPr>
+      <w:rPr>
+        <w:rFonts w:ascii="Wingdings" w:hAnsi="Wingdings" w:hint="default"/>
+      </w:rPr>
+    </w:lvl>
+  </w:abstractNum>
+  <w:abstractNum w:abstractNumId="14" w15:restartNumberingAfterBreak="0">
+    <w:nsid w:val="49563D43"/>
+    <w:multiLevelType w:val="hybridMultilevel"/>
+    <w:tmpl w:val="FA40F4DC"/>
+    <w:lvl w:ilvl="0" w:tplc="C3B8F722">
+      <w:numFmt w:val="bullet"/>
+      <w:lvlText w:val="•"/>
+      <w:lvlJc w:val="left"/>
+      <w:pPr>
+        <w:ind w:left="360" w:hanging="360"/>
+      </w:pPr>
+      <w:rPr>
+        <w:rFonts w:ascii="Cambria" w:eastAsiaTheme="minorEastAsia" w:hAnsi="Cambria" w:cstheme="minorBidi" w:hint="default"/>
+      </w:rPr>
+    </w:lvl>
+    <w:lvl w:ilvl="1" w:tplc="34090003" w:tentative="1">
+      <w:start w:val="1"/>
+      <w:numFmt w:val="bullet"/>
+      <w:lvlText w:val="o"/>
+      <w:lvlJc w:val="left"/>
+      <w:pPr>
+        <w:ind w:left="1440" w:hanging="360"/>
+      </w:pPr>
+      <w:rPr>
+        <w:rFonts w:ascii="Courier New" w:hAnsi="Courier New" w:cs="Courier New" w:hint="default"/>
+      </w:rPr>
+    </w:lvl>
+    <w:lvl w:ilvl="2" w:tplc="34090005" w:tentative="1">
+      <w:start w:val="1"/>
+      <w:numFmt w:val="bullet"/>
+      <w:lvlText w:val=""/>
+      <w:lvlJc w:val="left"/>
+      <w:pPr>
+        <w:ind w:left="2160" w:hanging="360"/>
+      </w:pPr>
+      <w:rPr>
+        <w:rFonts w:ascii="Wingdings" w:hAnsi="Wingdings" w:hint="default"/>
+      </w:rPr>
+    </w:lvl>
+    <w:lvl w:ilvl="3" w:tplc="34090001" w:tentative="1">
+      <w:start w:val="1"/>
+      <w:numFmt w:val="bullet"/>
+      <w:lvlText w:val=""/>
+      <w:lvlJc w:val="left"/>
+      <w:pPr>
+        <w:ind w:left="2880" w:hanging="360"/>
+      </w:pPr>
+      <w:rPr>
+        <w:rFonts w:ascii="Symbol" w:hAnsi="Symbol" w:hint="default"/>
+      </w:rPr>
+    </w:lvl>
+    <w:lvl w:ilvl="4" w:tplc="34090003" w:tentative="1">
+      <w:start w:val="1"/>
+      <w:numFmt w:val="bullet"/>
+      <w:lvlText w:val="o"/>
+      <w:lvlJc w:val="left"/>
+      <w:pPr>
+        <w:ind w:left="3600" w:hanging="360"/>
+      </w:pPr>
+      <w:rPr>
+        <w:rFonts w:ascii="Courier New" w:hAnsi="Courier New" w:cs="Courier New" w:hint="default"/>
+      </w:rPr>
+    </w:lvl>
+    <w:lvl w:ilvl="5" w:tplc="34090005" w:tentative="1">
+      <w:start w:val="1"/>
+      <w:numFmt w:val="bullet"/>
+      <w:lvlText w:val=""/>
+      <w:lvlJc w:val="left"/>
+      <w:pPr>
+        <w:ind w:left="4320" w:hanging="360"/>
+      </w:pPr>
+      <w:rPr>
+        <w:rFonts w:ascii="Wingdings" w:hAnsi="Wingdings" w:hint="default"/>
+      </w:rPr>
+    </w:lvl>
+    <w:lvl w:ilvl="6" w:tplc="34090001" w:tentative="1">
+      <w:start w:val="1"/>
+      <w:numFmt w:val="bullet"/>
+      <w:lvlText w:val=""/>
+      <w:lvlJc w:val="left"/>
+      <w:pPr>
+        <w:ind w:left="5040" w:hanging="360"/>
+      </w:pPr>
+      <w:rPr>
+        <w:rFonts w:ascii="Symbol" w:hAnsi="Symbol" w:hint="default"/>
+      </w:rPr>
+    </w:lvl>
+    <w:lvl w:ilvl="7" w:tplc="34090003" w:tentative="1">
+      <w:start w:val="1"/>
+      <w:numFmt w:val="bullet"/>
+      <w:lvlText w:val="o"/>
+      <w:lvlJc w:val="left"/>
+      <w:pPr>
+        <w:ind w:left="5760" w:hanging="360"/>
+      </w:pPr>
+      <w:rPr>
+        <w:rFonts w:ascii="Courier New" w:hAnsi="Courier New" w:cs="Courier New" w:hint="default"/>
+      </w:rPr>
+    </w:lvl>
+    <w:lvl w:ilvl="8" w:tplc="34090005" w:tentative="1">
+      <w:start w:val="1"/>
+      <w:numFmt w:val="bullet"/>
+      <w:lvlText w:val=""/>
+      <w:lvlJc w:val="left"/>
+      <w:pPr>
+        <w:ind w:left="6480" w:hanging="360"/>
+      </w:pPr>
+      <w:rPr>
+        <w:rFonts w:ascii="Wingdings" w:hAnsi="Wingdings" w:hint="default"/>
+      </w:rPr>
+    </w:lvl>
+  </w:abstractNum>
+  <w:abstractNum w:abstractNumId="15" w15:restartNumberingAfterBreak="0">
+    <w:nsid w:val="55462E38"/>
+    <w:multiLevelType w:val="hybridMultilevel"/>
+    <w:tmpl w:val="B340344E"/>
+    <w:lvl w:ilvl="0" w:tplc="34090001">
+      <w:start w:val="1"/>
+      <w:numFmt w:val="bullet"/>
+      <w:lvlText w:val=""/>
+      <w:lvlJc w:val="left"/>
+      <w:pPr>
+        <w:ind w:left="720" w:hanging="360"/>
+      </w:pPr>
+      <w:rPr>
+        <w:rFonts w:ascii="Symbol" w:hAnsi="Symbol" w:hint="default"/>
+      </w:rPr>
+    </w:lvl>
+    <w:lvl w:ilvl="1" w:tplc="0E926906">
+      <w:numFmt w:val="bullet"/>
+      <w:lvlText w:val="•"/>
+      <w:lvlJc w:val="left"/>
+      <w:pPr>
+        <w:ind w:left="1440" w:hanging="360"/>
+      </w:pPr>
+      <w:rPr>
+        <w:rFonts w:ascii="Cambria" w:eastAsiaTheme="minorEastAsia" w:hAnsi="Cambria" w:cstheme="minorBidi" w:hint="default"/>
+      </w:rPr>
+    </w:lvl>
+    <w:lvl w:ilvl="2" w:tplc="34090005" w:tentative="1">
+      <w:start w:val="1"/>
+      <w:numFmt w:val="bullet"/>
+      <w:lvlText w:val=""/>
+      <w:lvlJc w:val="left"/>
+      <w:pPr>
+        <w:ind w:left="2160" w:hanging="360"/>
+      </w:pPr>
+      <w:rPr>
+        <w:rFonts w:ascii="Wingdings" w:hAnsi="Wingdings" w:hint="default"/>
+      </w:rPr>
+    </w:lvl>
+    <w:lvl w:ilvl="3" w:tplc="34090001" w:tentative="1">
+      <w:start w:val="1"/>
+      <w:numFmt w:val="bullet"/>
+      <w:lvlText w:val=""/>
+      <w:lvlJc w:val="left"/>
+      <w:pPr>
+        <w:ind w:left="2880" w:hanging="360"/>
+      </w:pPr>
+      <w:rPr>
+        <w:rFonts w:ascii="Symbol" w:hAnsi="Symbol" w:hint="default"/>
+      </w:rPr>
+    </w:lvl>
+    <w:lvl w:ilvl="4" w:tplc="34090003" w:tentative="1">
+      <w:start w:val="1"/>
+      <w:numFmt w:val="bullet"/>
+      <w:lvlText w:val="o"/>
+      <w:lvlJc w:val="left"/>
+      <w:pPr>
+        <w:ind w:left="3600" w:hanging="360"/>
+      </w:pPr>
+      <w:rPr>
+        <w:rFonts w:ascii="Courier New" w:hAnsi="Courier New" w:cs="Courier New" w:hint="default"/>
+      </w:rPr>
+    </w:lvl>
+    <w:lvl w:ilvl="5" w:tplc="34090005" w:tentative="1">
+      <w:start w:val="1"/>
+      <w:numFmt w:val="bullet"/>
+      <w:lvlText w:val=""/>
+      <w:lvlJc w:val="left"/>
+      <w:pPr>
+        <w:ind w:left="4320" w:hanging="360"/>
+      </w:pPr>
+      <w:rPr>
+        <w:rFonts w:ascii="Wingdings" w:hAnsi="Wingdings" w:hint="default"/>
+      </w:rPr>
+    </w:lvl>
+    <w:lvl w:ilvl="6" w:tplc="34090001" w:tentative="1">
+      <w:start w:val="1"/>
+      <w:numFmt w:val="bullet"/>
+      <w:lvlText w:val=""/>
+      <w:lvlJc w:val="left"/>
+      <w:pPr>
+        <w:ind w:left="5040" w:hanging="360"/>
+      </w:pPr>
+      <w:rPr>
+        <w:rFonts w:ascii="Symbol" w:hAnsi="Symbol" w:hint="default"/>
+      </w:rPr>
+    </w:lvl>
+    <w:lvl w:ilvl="7" w:tplc="34090003" w:tentative="1">
+      <w:start w:val="1"/>
+      <w:numFmt w:val="bullet"/>
+      <w:lvlText w:val="o"/>
+      <w:lvlJc w:val="left"/>
+      <w:pPr>
+        <w:ind w:left="5760" w:hanging="360"/>
+      </w:pPr>
+      <w:rPr>
+        <w:rFonts w:ascii="Courier New" w:hAnsi="Courier New" w:cs="Courier New" w:hint="default"/>
+      </w:rPr>
+    </w:lvl>
+    <w:lvl w:ilvl="8" w:tplc="34090005" w:tentative="1">
+      <w:start w:val="1"/>
+      <w:numFmt w:val="bullet"/>
+      <w:lvlText w:val=""/>
+      <w:lvlJc w:val="left"/>
+      <w:pPr>
+        <w:ind w:left="6480" w:hanging="360"/>
+      </w:pPr>
+      <w:rPr>
+        <w:rFonts w:ascii="Wingdings" w:hAnsi="Wingdings" w:hint="default"/>
+      </w:rPr>
+    </w:lvl>
+  </w:abstractNum>
+  <w:abstractNum w:abstractNumId="16" w15:restartNumberingAfterBreak="0">
+    <w:nsid w:val="591D7F55"/>
+    <w:multiLevelType w:val="hybridMultilevel"/>
+    <w:tmpl w:val="62CCAE8E"/>
+    <w:lvl w:ilvl="0" w:tplc="C3B8F722">
+      <w:numFmt w:val="bullet"/>
+      <w:lvlText w:val="•"/>
+      <w:lvlJc w:val="left"/>
+      <w:pPr>
+        <w:ind w:left="360" w:hanging="360"/>
+      </w:pPr>
+      <w:rPr>
+        <w:rFonts w:ascii="Cambria" w:eastAsiaTheme="minorEastAsia" w:hAnsi="Cambria" w:cstheme="minorBidi" w:hint="default"/>
+      </w:rPr>
+    </w:lvl>
+    <w:lvl w:ilvl="1" w:tplc="34090003" w:tentative="1">
+      <w:start w:val="1"/>
+      <w:numFmt w:val="bullet"/>
+      <w:lvlText w:val="o"/>
+      <w:lvlJc w:val="left"/>
+      <w:pPr>
+        <w:ind w:left="1080" w:hanging="360"/>
+      </w:pPr>
+      <w:rPr>
+        <w:rFonts w:ascii="Courier New" w:hAnsi="Courier New" w:cs="Courier New" w:hint="default"/>
+      </w:rPr>
+    </w:lvl>
+    <w:lvl w:ilvl="2" w:tplc="34090005" w:tentative="1">
+      <w:start w:val="1"/>
+      <w:numFmt w:val="bullet"/>
+      <w:lvlText w:val=""/>
+      <w:lvlJc w:val="left"/>
+      <w:pPr>
+        <w:ind w:left="1800" w:hanging="360"/>
+      </w:pPr>
+      <w:rPr>
+        <w:rFonts w:ascii="Wingdings" w:hAnsi="Wingdings" w:hint="default"/>
+      </w:rPr>
+    </w:lvl>
+    <w:lvl w:ilvl="3" w:tplc="34090001" w:tentative="1">
+      <w:start w:val="1"/>
+      <w:numFmt w:val="bullet"/>
+      <w:lvlText w:val=""/>
+      <w:lvlJc w:val="left"/>
+      <w:pPr>
+        <w:ind w:left="2520" w:hanging="360"/>
+      </w:pPr>
+      <w:rPr>
+        <w:rFonts w:ascii="Symbol" w:hAnsi="Symbol" w:hint="default"/>
+      </w:rPr>
+    </w:lvl>
+    <w:lvl w:ilvl="4" w:tplc="34090003" w:tentative="1">
+      <w:start w:val="1"/>
+      <w:numFmt w:val="bullet"/>
+      <w:lvlText w:val="o"/>
+      <w:lvlJc w:val="left"/>
+      <w:pPr>
+        <w:ind w:left="3240" w:hanging="360"/>
+      </w:pPr>
+      <w:rPr>
+        <w:rFonts w:ascii="Courier New" w:hAnsi="Courier New" w:cs="Courier New" w:hint="default"/>
+      </w:rPr>
+    </w:lvl>
+    <w:lvl w:ilvl="5" w:tplc="34090005" w:tentative="1">
+      <w:start w:val="1"/>
+      <w:numFmt w:val="bullet"/>
+      <w:lvlText w:val=""/>
+      <w:lvlJc w:val="left"/>
+      <w:pPr>
+        <w:ind w:left="3960" w:hanging="360"/>
+      </w:pPr>
+      <w:rPr>
+        <w:rFonts w:ascii="Wingdings" w:hAnsi="Wingdings" w:hint="default"/>
+      </w:rPr>
+    </w:lvl>
+    <w:lvl w:ilvl="6" w:tplc="34090001" w:tentative="1">
+      <w:start w:val="1"/>
+      <w:numFmt w:val="bullet"/>
+      <w:lvlText w:val=""/>
+      <w:lvlJc w:val="left"/>
+      <w:pPr>
+        <w:ind w:left="4680" w:hanging="360"/>
+      </w:pPr>
+      <w:rPr>
+        <w:rFonts w:ascii="Symbol" w:hAnsi="Symbol" w:hint="default"/>
+      </w:rPr>
+    </w:lvl>
+    <w:lvl w:ilvl="7" w:tplc="34090003" w:tentative="1">
+      <w:start w:val="1"/>
+      <w:numFmt w:val="bullet"/>
+      <w:lvlText w:val="o"/>
+      <w:lvlJc w:val="left"/>
+      <w:pPr>
+        <w:ind w:left="5400" w:hanging="360"/>
+      </w:pPr>
+      <w:rPr>
+        <w:rFonts w:ascii="Courier New" w:hAnsi="Courier New" w:cs="Courier New" w:hint="default"/>
+      </w:rPr>
+    </w:lvl>
+    <w:lvl w:ilvl="8" w:tplc="34090005" w:tentative="1">
+      <w:start w:val="1"/>
+      <w:numFmt w:val="bullet"/>
+      <w:lvlText w:val=""/>
+      <w:lvlJc w:val="left"/>
+      <w:pPr>
+        <w:ind w:left="6120" w:hanging="360"/>
+      </w:pPr>
+      <w:rPr>
+        <w:rFonts w:ascii="Wingdings" w:hAnsi="Wingdings" w:hint="default"/>
+      </w:rPr>
+    </w:lvl>
+  </w:abstractNum>
+  <w:abstractNum w:abstractNumId="17" w15:restartNumberingAfterBreak="0">
     <w:nsid w:val="61012B9E"/>
     <w:multiLevelType w:val="hybridMultilevel"/>
     <w:tmpl w:val="F66C2D46"/>
@@ -1994,7 +2848,7 @@
       </w:rPr>
     </w:lvl>
   </w:abstractNum>
-  <w:abstractNum w:abstractNumId="11" w15:restartNumberingAfterBreak="0">
+  <w:abstractNum w:abstractNumId="18" w15:restartNumberingAfterBreak="0">
     <w:nsid w:val="6D506717"/>
     <w:multiLevelType w:val="hybridMultilevel"/>
     <w:tmpl w:val="59E88E52"/>
@@ -2095,6 +2949,119 @@
       </w:rPr>
     </w:lvl>
     <w:lvl w:ilvl="8" w:tplc="4C090005" w:tentative="1">
+      <w:start w:val="1"/>
+      <w:numFmt w:val="bullet"/>
+      <w:lvlText w:val=""/>
+      <w:lvlJc w:val="left"/>
+      <w:pPr>
+        <w:ind w:left="6480" w:hanging="360"/>
+      </w:pPr>
+      <w:rPr>
+        <w:rFonts w:ascii="Wingdings" w:hAnsi="Wingdings" w:hint="default"/>
+      </w:rPr>
+    </w:lvl>
+  </w:abstractNum>
+  <w:abstractNum w:abstractNumId="19" w15:restartNumberingAfterBreak="0">
+    <w:nsid w:val="7BDA20A5"/>
+    <w:multiLevelType w:val="hybridMultilevel"/>
+    <w:tmpl w:val="2258DFAC"/>
+    <w:lvl w:ilvl="0" w:tplc="34090001">
+      <w:start w:val="1"/>
+      <w:numFmt w:val="bullet"/>
+      <w:lvlText w:val=""/>
+      <w:lvlJc w:val="left"/>
+      <w:pPr>
+        <w:ind w:left="720" w:hanging="360"/>
+      </w:pPr>
+      <w:rPr>
+        <w:rFonts w:ascii="Symbol" w:hAnsi="Symbol" w:hint="default"/>
+      </w:rPr>
+    </w:lvl>
+    <w:lvl w:ilvl="1" w:tplc="34090003">
+      <w:start w:val="1"/>
+      <w:numFmt w:val="bullet"/>
+      <w:lvlText w:val="o"/>
+      <w:lvlJc w:val="left"/>
+      <w:pPr>
+        <w:ind w:left="1440" w:hanging="360"/>
+      </w:pPr>
+      <w:rPr>
+        <w:rFonts w:ascii="Courier New" w:hAnsi="Courier New" w:cs="Courier New" w:hint="default"/>
+      </w:rPr>
+    </w:lvl>
+    <w:lvl w:ilvl="2" w:tplc="34090005" w:tentative="1">
+      <w:start w:val="1"/>
+      <w:numFmt w:val="bullet"/>
+      <w:lvlText w:val=""/>
+      <w:lvlJc w:val="left"/>
+      <w:pPr>
+        <w:ind w:left="2160" w:hanging="360"/>
+      </w:pPr>
+      <w:rPr>
+        <w:rFonts w:ascii="Wingdings" w:hAnsi="Wingdings" w:hint="default"/>
+      </w:rPr>
+    </w:lvl>
+    <w:lvl w:ilvl="3" w:tplc="34090001" w:tentative="1">
+      <w:start w:val="1"/>
+      <w:numFmt w:val="bullet"/>
+      <w:lvlText w:val=""/>
+      <w:lvlJc w:val="left"/>
+      <w:pPr>
+        <w:ind w:left="2880" w:hanging="360"/>
+      </w:pPr>
+      <w:rPr>
+        <w:rFonts w:ascii="Symbol" w:hAnsi="Symbol" w:hint="default"/>
+      </w:rPr>
+    </w:lvl>
+    <w:lvl w:ilvl="4" w:tplc="34090003" w:tentative="1">
+      <w:start w:val="1"/>
+      <w:numFmt w:val="bullet"/>
+      <w:lvlText w:val="o"/>
+      <w:lvlJc w:val="left"/>
+      <w:pPr>
+        <w:ind w:left="3600" w:hanging="360"/>
+      </w:pPr>
+      <w:rPr>
+        <w:rFonts w:ascii="Courier New" w:hAnsi="Courier New" w:cs="Courier New" w:hint="default"/>
+      </w:rPr>
+    </w:lvl>
+    <w:lvl w:ilvl="5" w:tplc="34090005" w:tentative="1">
+      <w:start w:val="1"/>
+      <w:numFmt w:val="bullet"/>
+      <w:lvlText w:val=""/>
+      <w:lvlJc w:val="left"/>
+      <w:pPr>
+        <w:ind w:left="4320" w:hanging="360"/>
+      </w:pPr>
+      <w:rPr>
+        <w:rFonts w:ascii="Wingdings" w:hAnsi="Wingdings" w:hint="default"/>
+      </w:rPr>
+    </w:lvl>
+    <w:lvl w:ilvl="6" w:tplc="34090001" w:tentative="1">
+      <w:start w:val="1"/>
+      <w:numFmt w:val="bullet"/>
+      <w:lvlText w:val=""/>
+      <w:lvlJc w:val="left"/>
+      <w:pPr>
+        <w:ind w:left="5040" w:hanging="360"/>
+      </w:pPr>
+      <w:rPr>
+        <w:rFonts w:ascii="Symbol" w:hAnsi="Symbol" w:hint="default"/>
+      </w:rPr>
+    </w:lvl>
+    <w:lvl w:ilvl="7" w:tplc="34090003" w:tentative="1">
+      <w:start w:val="1"/>
+      <w:numFmt w:val="bullet"/>
+      <w:lvlText w:val="o"/>
+      <w:lvlJc w:val="left"/>
+      <w:pPr>
+        <w:ind w:left="5760" w:hanging="360"/>
+      </w:pPr>
+      <w:rPr>
+        <w:rFonts w:ascii="Courier New" w:hAnsi="Courier New" w:cs="Courier New" w:hint="default"/>
+      </w:rPr>
+    </w:lvl>
+    <w:lvl w:ilvl="8" w:tplc="34090005" w:tentative="1">
       <w:start w:val="1"/>
       <w:numFmt w:val="bullet"/>
       <w:lvlText w:val=""/>
@@ -2135,13 +3102,37 @@
     <w:abstractNumId w:val="0"/>
   </w:num>
   <w:num w:numId="10">
-    <w:abstractNumId w:val="10"/>
+    <w:abstractNumId w:val="17"/>
   </w:num>
   <w:num w:numId="11">
-    <w:abstractNumId w:val="11"/>
+    <w:abstractNumId w:val="18"/>
   </w:num>
   <w:num w:numId="12">
     <w:abstractNumId w:val="9"/>
+  </w:num>
+  <w:num w:numId="13">
+    <w:abstractNumId w:val="15"/>
+  </w:num>
+  <w:num w:numId="14">
+    <w:abstractNumId w:val="19"/>
+  </w:num>
+  <w:num w:numId="15">
+    <w:abstractNumId w:val="13"/>
+  </w:num>
+  <w:num w:numId="16">
+    <w:abstractNumId w:val="11"/>
+  </w:num>
+  <w:num w:numId="17">
+    <w:abstractNumId w:val="10"/>
+  </w:num>
+  <w:num w:numId="18">
+    <w:abstractNumId w:val="16"/>
+  </w:num>
+  <w:num w:numId="19">
+    <w:abstractNumId w:val="14"/>
+  </w:num>
+  <w:num w:numId="20">
+    <w:abstractNumId w:val="12"/>
   </w:num>
 </w:numbering>
 </file>
@@ -13525,6 +14516,29 @@
       </w:tcPr>
     </w:tblStylePr>
   </w:style>
+  <w:style w:type="character" w:styleId="Hyperlink">
+    <w:name w:val="Hyperlink"/>
+    <w:basedOn w:val="DefaultParagraphFont"/>
+    <w:uiPriority w:val="99"/>
+    <w:unhideWhenUsed/>
+    <w:rsid w:val="00761956"/>
+    <w:rPr>
+      <w:color w:val="0000FF" w:themeColor="hyperlink"/>
+      <w:u w:val="single"/>
+    </w:rPr>
+  </w:style>
+  <w:style w:type="character" w:styleId="UnresolvedMention">
+    <w:name w:val="Unresolved Mention"/>
+    <w:basedOn w:val="DefaultParagraphFont"/>
+    <w:uiPriority w:val="99"/>
+    <w:semiHidden/>
+    <w:unhideWhenUsed/>
+    <w:rsid w:val="00761956"/>
+    <w:rPr>
+      <w:color w:val="605E5C"/>
+      <w:shd w:val="clear" w:color="auto" w:fill="E1DFDD"/>
+    </w:rPr>
+  </w:style>
 </w:styles>
 </file>
 
@@ -13853,7 +14867,7 @@
 </file>
 
 <file path=customXml/itemProps1.xml><?xml version="1.0" encoding="utf-8"?>
-<ds:datastoreItem xmlns:ds="http://schemas.openxmlformats.org/officeDocument/2006/customXml" ds:itemID="{71507268-5389-4DD0-95AF-A6EEFA3431B5}">
+<ds:datastoreItem xmlns:ds="http://schemas.openxmlformats.org/officeDocument/2006/customXml" ds:itemID="{95AA7E66-D72D-4A5F-9D58-77E35D032D8C}">
   <ds:schemaRefs>
     <ds:schemaRef ds:uri="http://schemas.openxmlformats.org/officeDocument/2006/bibliography"/>
   </ds:schemaRefs>

</xml_diff>

<commit_message>
Refresh portfolio: skills section, working contact form, updated CV.
Replace services with skills and experience, remove CV download links, and wire the contact form to FormSubmit.
</commit_message>
<xml_diff>
--- a/assets/Mark-Tristan-De-Villa-CV.docx
+++ b/assets/Mark-Tristan-De-Villa-CV.docx
@@ -11,17 +11,15 @@
           <w:b/>
           <w:sz w:val="44"/>
         </w:rPr>
-        <w:t xml:space="preserve">MARK TRISTAN P. DE </w:t>
-      </w:r>
-      <w:proofErr w:type="spellStart"/>
+        <w:t>MARK TRISTAN P. DE VI</w:t>
+      </w:r>
       <w:r>
         <w:rPr>
           <w:b/>
           <w:sz w:val="44"/>
         </w:rPr>
-        <w:t>VIllA</w:t>
-      </w:r>
-      <w:proofErr w:type="spellEnd"/>
+        <w:t>LLA</w:t>
+      </w:r>
     </w:p>
     <w:p>
       <w:pPr>
@@ -46,12 +44,7 @@
         <w:t xml:space="preserve">| </w:t>
       </w:r>
       <w:r>
-        <w:t>https://tannntannn.githu</w:t>
-      </w:r>
-      <w:bookmarkStart w:id="0" w:name="_GoBack"/>
-      <w:bookmarkEnd w:id="0"/>
-      <w:r>
-        <w:t>b.io/portfolio</w:t>
+        <w:t>https://tannntannn.github.io/portfolio</w:t>
       </w:r>
       <w:r>
         <w:t xml:space="preserve"> </w:t>
@@ -98,34 +91,26 @@
     </w:p>
     <w:p>
       <w:pPr>
+        <w:spacing w:after="0" w:line="240" w:lineRule="auto"/>
         <w:jc w:val="both"/>
       </w:pPr>
       <w:r>
-        <w:t>Information Technology graduate with hands-on experience in</w:t>
-      </w:r>
-      <w:r>
-        <w:t xml:space="preserve"> software</w:t>
-      </w:r>
-      <w:r>
-        <w:t xml:space="preserve"> </w:t>
-      </w:r>
-      <w:r>
-        <w:t>development</w:t>
-      </w:r>
-      <w:r>
-        <w:t xml:space="preserve"> and </w:t>
+        <w:t xml:space="preserve">Information Technology graduate with hands-on experience in full-stack web development, Android development, and WordPress development. Skilled in building modern web applications using React, Next.js, Firebase, </w:t>
       </w:r>
       <w:proofErr w:type="spellStart"/>
       <w:r>
-        <w:t>Wordpress</w:t>
+        <w:t>Supabase</w:t>
       </w:r>
       <w:proofErr w:type="spellEnd"/>
       <w:r>
-        <w:t xml:space="preserve"> Development</w:t>
-      </w:r>
-      <w:r>
-        <w:t>. Experienced in collaborating with teams, solving technical challenges, and building practical technology solutions through academic projects, internships, and continuous self-learning.</w:t>
-      </w:r>
+        <w:t>, and Java. Passionate about creating user-focused software solutions through continuous learning and collaboration</w:t>
+      </w:r>
+    </w:p>
+    <w:p>
+      <w:pPr>
+        <w:spacing w:after="0" w:line="240" w:lineRule="auto"/>
+        <w:jc w:val="both"/>
+      </w:pPr>
     </w:p>
     <w:p>
       <w:pPr>
@@ -209,17 +194,15 @@
     </w:p>
     <w:p>
       <w:pPr>
-        <w:spacing w:after="0"/>
+        <w:spacing w:after="0" w:line="360" w:lineRule="auto"/>
         <w:jc w:val="both"/>
       </w:pPr>
       <w:r>
         <w:t>College of Sciences, Technology and Communications, Inc. (CSTC)</w:t>
       </w:r>
-    </w:p>
-    <w:p>
-      <w:pPr>
-        <w:jc w:val="both"/>
-      </w:pPr>
+      <w:r>
+        <w:t xml:space="preserve"> </w:t>
+      </w:r>
       <w:proofErr w:type="spellStart"/>
       <w:r>
         <w:t>Sariaya</w:t>
@@ -294,7 +277,13 @@
         <w:t xml:space="preserve">  </w:t>
       </w:r>
       <w:r>
-        <w:t xml:space="preserve">   Jan 2026 – May 2026</w:t>
+        <w:t xml:space="preserve">   Jan 2026 – </w:t>
+      </w:r>
+      <w:r>
+        <w:t>Nov</w:t>
+      </w:r>
+      <w:r>
+        <w:t xml:space="preserve"> 2026</w:t>
       </w:r>
     </w:p>
     <w:p>
@@ -386,7 +375,10 @@
         <w:tab/>
       </w:r>
       <w:r>
-        <w:tab/>
+        <w:t xml:space="preserve"> (C</w:t>
+      </w:r>
+      <w:r>
+        <w:t>apstone Project)</w:t>
       </w:r>
       <w:r>
         <w:tab/>
@@ -394,12 +386,6 @@
       </w:r>
       <w:r>
         <w:t xml:space="preserve"> </w:t>
-      </w:r>
-      <w:r>
-        <w:t xml:space="preserve">        </w:t>
-      </w:r>
-      <w:r>
-        <w:t>Jul 2025 – Oct 2025</w:t>
       </w:r>
     </w:p>
     <w:p>
@@ -483,6 +469,18 @@
       <w:r>
         <w:t xml:space="preserve"> for secure user management, data storage, and classroom management.</w:t>
       </w:r>
+    </w:p>
+    <w:p>
+      <w:pPr>
+        <w:pStyle w:val="ListBullet"/>
+        <w:numPr>
+          <w:ilvl w:val="0"/>
+          <w:numId w:val="0"/>
+        </w:numPr>
+        <w:spacing w:line="240" w:lineRule="auto"/>
+        <w:ind w:left="360"/>
+        <w:jc w:val="both"/>
+      </w:pPr>
     </w:p>
     <w:p>
       <w:pPr>
@@ -493,16 +491,6 @@
         </w:numPr>
         <w:jc w:val="both"/>
       </w:pPr>
-    </w:p>
-    <w:p>
-      <w:pPr>
-        <w:pStyle w:val="ListBullet"/>
-        <w:numPr>
-          <w:ilvl w:val="0"/>
-          <w:numId w:val="0"/>
-        </w:numPr>
-        <w:jc w:val="both"/>
-      </w:pPr>
       <w:proofErr w:type="spellStart"/>
       <w:r>
         <w:t>AspireWrite</w:t>
@@ -535,18 +523,6 @@
       <w:r>
         <w:tab/>
         <w:t xml:space="preserve">                            </w:t>
-      </w:r>
-      <w:r>
-        <w:t>Feb 2023</w:t>
-      </w:r>
-      <w:r>
-        <w:t xml:space="preserve"> - July</w:t>
-      </w:r>
-      <w:r>
-        <w:t xml:space="preserve"> </w:t>
-      </w:r>
-      <w:r>
-        <w:t>2026</w:t>
       </w:r>
     </w:p>
     <w:p>
@@ -631,6 +607,30 @@
       <w:r>
         <w:t>SLSU Campus Market Place</w:t>
       </w:r>
+      <w:r>
+        <w:tab/>
+      </w:r>
+      <w:r>
+        <w:tab/>
+      </w:r>
+      <w:r>
+        <w:tab/>
+      </w:r>
+      <w:r>
+        <w:tab/>
+      </w:r>
+      <w:r>
+        <w:tab/>
+      </w:r>
+      <w:r>
+        <w:tab/>
+      </w:r>
+      <w:r>
+        <w:tab/>
+      </w:r>
+      <w:r>
+        <w:tab/>
+      </w:r>
     </w:p>
     <w:p>
       <w:pPr>
@@ -725,11 +725,42 @@
       </w:pPr>
       <w:proofErr w:type="spellStart"/>
       <w:r>
+        <w:lastRenderedPageBreak/>
         <w:t>FitnessHood</w:t>
       </w:r>
       <w:proofErr w:type="spellEnd"/>
       <w:r>
         <w:t xml:space="preserve"> </w:t>
+      </w:r>
+      <w:r>
+        <w:tab/>
+      </w:r>
+      <w:r>
+        <w:tab/>
+      </w:r>
+      <w:r>
+        <w:tab/>
+      </w:r>
+      <w:r>
+        <w:tab/>
+      </w:r>
+      <w:r>
+        <w:tab/>
+      </w:r>
+      <w:r>
+        <w:tab/>
+      </w:r>
+      <w:r>
+        <w:tab/>
+      </w:r>
+      <w:r>
+        <w:tab/>
+      </w:r>
+      <w:r>
+        <w:tab/>
+      </w:r>
+      <w:r>
+        <w:tab/>
       </w:r>
     </w:p>
     <w:p>
@@ -805,7 +836,7 @@
       </w:r>
       <w:proofErr w:type="spellStart"/>
       <w:r>
-        <w:t>Suppabase</w:t>
+        <w:t>Supabase</w:t>
       </w:r>
       <w:proofErr w:type="spellEnd"/>
       <w:r>
@@ -1145,13 +1176,8 @@
             </w:r>
             <w:proofErr w:type="spellEnd"/>
             <w:r>
-              <w:t xml:space="preserve"> web </w:t>
+              <w:t xml:space="preserve"> web hosting</w:t>
             </w:r>
-            <w:proofErr w:type="spellStart"/>
-            <w:r>
-              <w:t>shosting</w:t>
-            </w:r>
-            <w:proofErr w:type="spellEnd"/>
             <w:r>
               <w:t xml:space="preserve"> and Firebase</w:t>
             </w:r>
@@ -1211,7 +1237,7 @@
             </w:r>
             <w:proofErr w:type="spellStart"/>
             <w:r>
-              <w:t>suppabase</w:t>
+              <w:t>supabase</w:t>
             </w:r>
             <w:proofErr w:type="spellEnd"/>
           </w:p>
@@ -1359,15 +1385,7 @@
               <w:t>Basic knowledge</w:t>
             </w:r>
             <w:r>
-              <w:t xml:space="preserve"> in Software Troubleshooting (Windows </w:t>
-            </w:r>
-            <w:proofErr w:type="spellStart"/>
-            <w:r>
-              <w:t>Os</w:t>
-            </w:r>
-            <w:proofErr w:type="spellEnd"/>
-            <w:r>
-              <w:t>)</w:t>
+              <w:t xml:space="preserve"> in Software Troubleshooting </w:t>
             </w:r>
           </w:p>
         </w:tc>
@@ -1407,7 +1425,20 @@
               <w:t>Basic</w:t>
             </w:r>
             <w:r>
-              <w:t xml:space="preserve"> knowledge in Figma, Canva, Adobe Illustrator, </w:t>
+              <w:t xml:space="preserve"> knowledge in </w:t>
+            </w:r>
+            <w:proofErr w:type="spellStart"/>
+            <w:r>
+              <w:t>Figma</w:t>
+            </w:r>
+            <w:proofErr w:type="spellEnd"/>
+            <w:r>
+              <w:t>, Canva, Adobe</w:t>
+            </w:r>
+            <w:bookmarkStart w:id="0" w:name="_GoBack"/>
+            <w:bookmarkEnd w:id="0"/>
+            <w:r>
+              <w:t xml:space="preserve">, </w:t>
             </w:r>
             <w:proofErr w:type="spellStart"/>
             <w:r>
@@ -1500,22 +1531,10 @@
           <w:b/>
           <w:bCs/>
         </w:rPr>
-        <w:t>Certificate/</w:t>
-      </w:r>
-      <w:proofErr w:type="gramStart"/>
-      <w:r>
-        <w:rPr>
-          <w:b/>
-          <w:bCs/>
-        </w:rPr>
-        <w:t xml:space="preserve">Seminars </w:t>
-      </w:r>
-      <w:r>
-        <w:t>:</w:t>
-      </w:r>
-      <w:proofErr w:type="gramEnd"/>
-      <w:r>
-        <w:t xml:space="preserve"> </w:t>
+        <w:t>Certificate/Seminars</w:t>
+      </w:r>
+      <w:r>
+        <w:t xml:space="preserve">: </w:t>
       </w:r>
     </w:p>
     <w:p>
@@ -1537,84 +1556,6 @@
         </w:rPr>
         <w:t xml:space="preserve"> - Coding Bootcamp: Data Visualization Workshop</w:t>
       </w:r>
-    </w:p>
-    <w:p>
-      <w:pPr>
-        <w:pStyle w:val="ListBullet"/>
-        <w:rPr>
-          <w:lang w:eastAsia="en-PH"/>
-        </w:rPr>
-      </w:pPr>
-      <w:bookmarkStart w:id="1" w:name="_Hlk221490509"/>
-      <w:r>
-        <w:rPr>
-          <w:lang w:eastAsia="en-PH"/>
-        </w:rPr>
-        <w:t>ITSC 2023 - Information Technology, Is it really Worth it?</w:t>
-      </w:r>
-    </w:p>
-    <w:p>
-      <w:pPr>
-        <w:pStyle w:val="ListBullet"/>
-        <w:rPr>
-          <w:lang w:eastAsia="en-PH"/>
-        </w:rPr>
-      </w:pPr>
-      <w:r>
-        <w:rPr>
-          <w:lang w:eastAsia="en-PH"/>
-        </w:rPr>
-        <w:t>ITSC 2024 - Navigating the Cloud: Revolutionizing IT Landscape</w:t>
-      </w:r>
-      <w:r>
-        <w:rPr>
-          <w:lang w:eastAsia="en-PH"/>
-        </w:rPr>
-        <w:tab/>
-      </w:r>
-    </w:p>
-    <w:p>
-      <w:pPr>
-        <w:pStyle w:val="ListBullet"/>
-        <w:rPr>
-          <w:lang w:eastAsia="en-PH"/>
-        </w:rPr>
-      </w:pPr>
-      <w:r>
-        <w:rPr>
-          <w:lang w:eastAsia="en-PH"/>
-        </w:rPr>
-        <w:t>November Syntax Seminar 2024 - Behind Screens: Exploring</w:t>
-      </w:r>
-    </w:p>
-    <w:p>
-      <w:pPr>
-        <w:pStyle w:val="ListBullet"/>
-        <w:rPr>
-          <w:lang w:eastAsia="en-PH"/>
-        </w:rPr>
-      </w:pPr>
-      <w:r>
-        <w:rPr>
-          <w:lang w:eastAsia="en-PH"/>
-        </w:rPr>
-        <w:t>TSC 2025 – Elevate: Embark Learning to Elevate Vibrance</w:t>
-      </w:r>
-      <w:r>
-        <w:rPr>
-          <w:lang w:eastAsia="en-PH"/>
-        </w:rPr>
-        <w:t xml:space="preserve">, </w:t>
-      </w:r>
-      <w:r>
-        <w:rPr>
-          <w:rFonts w:ascii="Arial" w:eastAsia="Times New Roman" w:hAnsi="Arial" w:cs="Arial"/>
-          <w:color w:val="000000"/>
-          <w:lang w:eastAsia="en-PH"/>
-        </w:rPr>
-        <w:t>Amplify Talent, and Excel Beyond IT Expectation</w:t>
-      </w:r>
-      <w:bookmarkEnd w:id="1"/>
     </w:p>
     <w:sectPr>
       <w:pgSz w:w="11906" w:h="16838" w:code="9"/>
@@ -14867,7 +14808,7 @@
 </file>
 
 <file path=customXml/itemProps1.xml><?xml version="1.0" encoding="utf-8"?>
-<ds:datastoreItem xmlns:ds="http://schemas.openxmlformats.org/officeDocument/2006/customXml" ds:itemID="{95AA7E66-D72D-4A5F-9D58-77E35D032D8C}">
+<ds:datastoreItem xmlns:ds="http://schemas.openxmlformats.org/officeDocument/2006/customXml" ds:itemID="{400CC8DC-610F-4E87-934E-04F29649ED27}">
   <ds:schemaRefs>
     <ds:schemaRef ds:uri="http://schemas.openxmlformats.org/officeDocument/2006/bibliography"/>
   </ds:schemaRefs>

</xml_diff>